<commit_message>
Move to two pricing tiers: Meta $2,000/mo, Meta + Google $4,000/mo
Drops the three-tier Meta / Meta+TikTok-or-Google / Meta+TikTok+Google
structure and the TikTok option entirely. Two tiers now: Meta ads
managed end to end at $2,000/month, or Meta + Google at $4,000/month.

Updated everywhere the old figures or TikTok appeared: the pricing
page, the services page, the web proposal's investment section, the
mailed two-page sheet, and the printable one-page leave-behind. Also
updated the service agreement, invoice template, and account access
guide in onboarding/, since the signed agreement's fee section needs
to match what every proposal quotes.

Ad spend guidance ($500-$1,000/mo per platform, $50/day minimum for
the guarantee) is unchanged — the fee increase is independent of ad
spend, which the client still pays directly to the platforms.

Co-Authored-By: Claude Sonnet 5 <noreply@anthropic.com>
</commit_message>
<xml_diff>
--- a/onboarding/DentaScale-Invoice-TEMPLATE.docx
+++ b/onboarding/DentaScale-Invoice-TEMPLATE.docx
@@ -625,7 +625,7 @@
                 <w:sz w:val="21"/>
                 <w:szCs w:val="21"/>
               </w:rPr>
-              <w:t xml:space="preserve">$1,000.00</w:t>
+              <w:t xml:space="preserve">$2,000.00</w:t>
             </w:r>
           </w:p>
         </w:tc>
@@ -657,7 +657,7 @@
                 <w:sz w:val="21"/>
                 <w:szCs w:val="21"/>
               </w:rPr>
-              <w:t xml:space="preserve">$1,000.00</w:t>
+              <w:t xml:space="preserve">$2,000.00</w:t>
             </w:r>
           </w:p>
         </w:tc>
@@ -1295,7 +1295,7 @@
                 <w:sz w:val="21"/>
                 <w:szCs w:val="21"/>
               </w:rPr>
-              <w:t xml:space="preserve">$1,000.00</w:t>
+              <w:t xml:space="preserve">$2,000.00</w:t>
             </w:r>
           </w:p>
         </w:tc>
@@ -1386,7 +1386,7 @@
           <w:sz w:val="19"/>
           <w:szCs w:val="19"/>
         </w:rPr>
-        <w:t xml:space="preserve">Advertising spend is billed separately by Meta, TikTok, and Google directly to your own payment method and does not pass through DentaScale.</w:t>
+        <w:t xml:space="preserve">Advertising spend is billed separately by Meta and Google directly to your own payment method and does not pass through DentaScale.</w:t>
       </w:r>
     </w:p>
     <w:p>

</xml_diff>